<commit_message>
eCRF 24: 25% per sessie, tot drie aanpassingen (kolom extra ontlastingstest 3); Usual Care alleen op maand 6, geblindeerd
Co-Authored-By: Claude Opus 5.5 <noreply@anthropic.com>
</commit_message>
<xml_diff>
--- a/(e)CRF/Per nummer/24_Meting drukherverdeling voetorthese.docx
+++ b/(e)CRF/Per nummer/24_Meting drukherverdeling voetorthese.docx
@@ -26,7 +26,7 @@
           <w:szCs w:val="28"/>
           <w:lang w:val="en-US"/>
         </w:rPr>
-        <w:t>Appendix 24: Pressure redistribution efficacy of CMFO  (visit 2, and months 6, 12 and 18)</w:t>
+        <w:t>Appendix 24: Pressure redistribution efficacy of CMFO  (Optimal Care: visit 2 and months 6, 12 and 18; Usual Care: month 6)</w:t>
       </w:r>
       <w:proofErr w:type="gramStart"/>
       <w:r>
@@ -250,7 +250,7 @@
           <w:i/>
           <w:color w:val="24303B"/>
         </w:rPr>
-        <w:t>In te vullen op visite 2 en opnieuw op maand 6, 12 en 18. De meting gebeurt in béíde armen. In de Optimal Care-arm worden de resultaten met de deelnemer en de pedorthist besproken en wordt de voetorthese erop bijgestuurd; in de Usual Care-arm gebeurt de meting geblindeerd — ze wordt niet getoond, niet besproken en stuurt de zorg niet bij.</w:t>
+        <w:t>Optimal Care: in te vullen op visite 2 en opnieuw op maand 6, 12 en 18; de resultaten worden met de deelnemer en de pedorthist besproken en de voetorthese wordt erop bijgestuurd. Usual Care: alleen op maand 6, geblindeerd — tweede palet met Pressure Cut Off 50 kPa en de waarden uit; de meting wordt niet getoond, niet besproken en stuurt de zorg niet bij, en de doelregio’s komen van de baselinemeting (eCRF 09). Elke meting is in-shoe, eerst zónder en dan mét de CMFO.</w:t>
       </w:r>
     </w:p>
     <w:p>
@@ -1554,7 +1554,7 @@
           <w:bCs/>
           <w:color w:val="123A5F"/>
         </w:rPr>
-        <w:t>Ontlastingsdoel per doelregio: piekdruk onder 200 kPa, óf minstens 25% lager dan de baselinemeting zónder de CMFO bij de aflevering op visite 2. Die baseline blijft ook op maand 6, 12 en 18 de referentie. Eén van beide volstaat. Is het doel niet gehaald, pas de CMFO aan en meet opnieuw; noteer die metingen in de kolommen extra ontlastingstest 1 en 2.</w:t>
+        <w:t>Ontlastingsdoel per doelregio (Optimal Care): piekdruk onder 200 kPa, óf minstens 25% lager dan zónder de CMFO in dezelfde sessie (tabel 2). Eén van beide volstaat. Is het doel niet gehaald, pas de CMFO aan en meet opnieuw mét de CMFO, tot drie aanpassingen; noteer die metingen in de kolommen extra ontlastingstest 1 tot 3.</w:t>
       </w:r>
     </w:p>
     <w:p>
@@ -1581,10 +1581,11 @@
       </w:tblPr>
       <w:tblGrid>
         <w:gridCol w:w="964"/>
-        <w:gridCol w:w="1892"/>
-        <w:gridCol w:w="2139"/>
-        <w:gridCol w:w="2147"/>
-        <w:gridCol w:w="2147"/>
+        <w:gridCol w:w="1644"/>
+        <w:gridCol w:w="1608"/>
+        <w:gridCol w:w="1608"/>
+        <w:gridCol w:w="1608"/>
+        <w:gridCol w:w="1608"/>
       </w:tblGrid>
       <w:tr>
         <w:trPr>
@@ -1620,8 +1621,8 @@
         </w:tc>
         <w:tc>
           <w:tcPr>
-            <w:tcW w:w="6433" w:type="dxa"/>
-            <w:gridSpan w:val="3"/>
+            <w:tcW w:w="6432" w:type="dxa"/>
+            <w:gridSpan w:val="4"/>
             <w:hideMark/>
           </w:tcPr>
           <w:p>
@@ -1704,7 +1705,7 @@
         </w:tc>
         <w:tc>
           <w:tcPr>
-            <w:tcW w:w="2139" w:type="dxa"/>
+            <w:tcW w:w="1608" w:type="dxa"/>
             <w:noWrap/>
             <w:hideMark/>
           </w:tcPr>
@@ -1725,7 +1726,7 @@
         </w:tc>
         <w:tc>
           <w:tcPr>
-            <w:tcW w:w="2147" w:type="dxa"/>
+            <w:tcW w:w="1608" w:type="dxa"/>
             <w:noWrap/>
             <w:hideMark/>
           </w:tcPr>
@@ -1746,7 +1747,7 @@
         </w:tc>
         <w:tc>
           <w:tcPr>
-            <w:tcW w:w="2147" w:type="dxa"/>
+            <w:tcW w:w="1608" w:type="dxa"/>
             <w:noWrap/>
             <w:hideMark/>
           </w:tcPr>
@@ -1762,6 +1763,27 @@
                 <w:color w:val="24303B"/>
               </w:rPr>
               <w:t>Extra ontlastingstest 2</w:t>
+            </w:r>
+          </w:p>
+        </w:tc>
+        <w:tc>
+          <w:tcPr>
+            <w:tcW w:w="1608" w:type="dxa"/>
+            <w:noWrap/>
+            <w:hideMark/>
+          </w:tcPr>
+          <w:p>
+            <w:pPr>
+              <w:jc w:val="center"/>
+              <w:rPr>
+                <w:rFonts w:ascii="Calibri" w:hAnsi="Calibri" w:cs="Calibri"/>
+              </w:rPr>
+            </w:pPr>
+            <w:r>
+              <w:rPr>
+                <w:color w:val="24303B"/>
+              </w:rPr>
+              <w:t>Extra ontlastingstest 3</w:t>
             </w:r>
           </w:p>
         </w:tc>
@@ -1816,7 +1838,7 @@
         </w:tc>
         <w:tc>
           <w:tcPr>
-            <w:tcW w:w="2139" w:type="dxa"/>
+            <w:tcW w:w="1608" w:type="dxa"/>
             <w:noWrap/>
             <w:hideMark/>
           </w:tcPr>
@@ -1836,7 +1858,7 @@
         </w:tc>
         <w:tc>
           <w:tcPr>
-            <w:tcW w:w="2147" w:type="dxa"/>
+            <w:tcW w:w="1608" w:type="dxa"/>
             <w:noWrap/>
             <w:hideMark/>
           </w:tcPr>
@@ -1856,7 +1878,27 @@
         </w:tc>
         <w:tc>
           <w:tcPr>
-            <w:tcW w:w="2147" w:type="dxa"/>
+            <w:tcW w:w="1608" w:type="dxa"/>
+            <w:noWrap/>
+            <w:hideMark/>
+          </w:tcPr>
+          <w:p>
+            <w:pPr>
+              <w:rPr>
+                <w:rFonts w:ascii="Calibri" w:hAnsi="Calibri" w:cs="Calibri"/>
+              </w:rPr>
+            </w:pPr>
+            <w:r>
+              <w:rPr>
+                <w:color w:val="24303B"/>
+              </w:rPr>
+              <w:t>Piekdruk (kPa)</w:t>
+            </w:r>
+          </w:p>
+        </w:tc>
+        <w:tc>
+          <w:tcPr>
+            <w:tcW w:w="1608" w:type="dxa"/>
             <w:noWrap/>
             <w:hideMark/>
           </w:tcPr>
@@ -1921,7 +1963,7 @@
         </w:tc>
         <w:tc>
           <w:tcPr>
-            <w:tcW w:w="2139" w:type="dxa"/>
+            <w:tcW w:w="1608" w:type="dxa"/>
             <w:noWrap/>
             <w:hideMark/>
           </w:tcPr>
@@ -1941,7 +1983,7 @@
         </w:tc>
         <w:tc>
           <w:tcPr>
-            <w:tcW w:w="2147" w:type="dxa"/>
+            <w:tcW w:w="1608" w:type="dxa"/>
             <w:noWrap/>
             <w:hideMark/>
           </w:tcPr>
@@ -1961,7 +2003,27 @@
         </w:tc>
         <w:tc>
           <w:tcPr>
-            <w:tcW w:w="2147" w:type="dxa"/>
+            <w:tcW w:w="1608" w:type="dxa"/>
+            <w:noWrap/>
+            <w:hideMark/>
+          </w:tcPr>
+          <w:p>
+            <w:pPr>
+              <w:rPr>
+                <w:rFonts w:ascii="Calibri" w:hAnsi="Calibri" w:cs="Calibri"/>
+              </w:rPr>
+            </w:pPr>
+            <w:r>
+              <w:rPr>
+                <w:color w:val="24303B"/>
+              </w:rPr>
+              <w:t> </w:t>
+            </w:r>
+          </w:p>
+        </w:tc>
+        <w:tc>
+          <w:tcPr>
+            <w:tcW w:w="1608" w:type="dxa"/>
             <w:noWrap/>
             <w:hideMark/>
           </w:tcPr>
@@ -2026,7 +2088,7 @@
         </w:tc>
         <w:tc>
           <w:tcPr>
-            <w:tcW w:w="2139" w:type="dxa"/>
+            <w:tcW w:w="1608" w:type="dxa"/>
             <w:noWrap/>
             <w:hideMark/>
           </w:tcPr>
@@ -2046,7 +2108,7 @@
         </w:tc>
         <w:tc>
           <w:tcPr>
-            <w:tcW w:w="2147" w:type="dxa"/>
+            <w:tcW w:w="1608" w:type="dxa"/>
             <w:noWrap/>
             <w:hideMark/>
           </w:tcPr>
@@ -2066,7 +2128,27 @@
         </w:tc>
         <w:tc>
           <w:tcPr>
-            <w:tcW w:w="2147" w:type="dxa"/>
+            <w:tcW w:w="1608" w:type="dxa"/>
+            <w:noWrap/>
+            <w:hideMark/>
+          </w:tcPr>
+          <w:p>
+            <w:pPr>
+              <w:rPr>
+                <w:rFonts w:ascii="Calibri" w:hAnsi="Calibri" w:cs="Calibri"/>
+              </w:rPr>
+            </w:pPr>
+            <w:r>
+              <w:rPr>
+                <w:color w:val="24303B"/>
+              </w:rPr>
+              <w:t> </w:t>
+            </w:r>
+          </w:p>
+        </w:tc>
+        <w:tc>
+          <w:tcPr>
+            <w:tcW w:w="1608" w:type="dxa"/>
             <w:noWrap/>
             <w:hideMark/>
           </w:tcPr>
@@ -2131,7 +2213,7 @@
         </w:tc>
         <w:tc>
           <w:tcPr>
-            <w:tcW w:w="2139" w:type="dxa"/>
+            <w:tcW w:w="1608" w:type="dxa"/>
             <w:noWrap/>
             <w:hideMark/>
           </w:tcPr>
@@ -2151,7 +2233,7 @@
         </w:tc>
         <w:tc>
           <w:tcPr>
-            <w:tcW w:w="2147" w:type="dxa"/>
+            <w:tcW w:w="1608" w:type="dxa"/>
             <w:noWrap/>
             <w:hideMark/>
           </w:tcPr>
@@ -2171,7 +2253,27 @@
         </w:tc>
         <w:tc>
           <w:tcPr>
-            <w:tcW w:w="2147" w:type="dxa"/>
+            <w:tcW w:w="1608" w:type="dxa"/>
+            <w:noWrap/>
+            <w:hideMark/>
+          </w:tcPr>
+          <w:p>
+            <w:pPr>
+              <w:rPr>
+                <w:rFonts w:ascii="Calibri" w:hAnsi="Calibri" w:cs="Calibri"/>
+              </w:rPr>
+            </w:pPr>
+            <w:r>
+              <w:rPr>
+                <w:color w:val="24303B"/>
+              </w:rPr>
+              <w:t> </w:t>
+            </w:r>
+          </w:p>
+        </w:tc>
+        <w:tc>
+          <w:tcPr>
+            <w:tcW w:w="1608" w:type="dxa"/>
             <w:noWrap/>
             <w:hideMark/>
           </w:tcPr>

</xml_diff>